<commit_message>
Add MSE Phase 1 presentation, PennyLane appendix diagrams, and risk-ranking metrics
Moves the Stage I mid-sem presentation (LaTeX source, compiled PDFs,
tectonic binary) into MSE_Phase1/. Also adds the QGNN v3.1 experiment
script, risk-ranking metrics module with tests, PennyLane circuit/Bloch
sphere appendix diagrams, and an updated final research report.

Co-Authored-By: Claude Sonnet 5 <noreply@anthropic.com>
</commit_message>
<xml_diff>
--- a/QGNN_V4_Final_Research_Report.docx
+++ b/QGNN_V4_Final_Research_Report.docx
@@ -1800,6 +1800,34 @@
           <w:szCs w:val="22"/>
         </w:rPr>
         <w:t xml:space="preserve">	57</w:t>
+      </w:r>
+    </w:p>
+    <w:p>
+      <w:pPr>
+        <w:tabs>
+          <w:tab w:val="right" w:pos="9028" w:leader="dot"/>
+        </w:tabs>
+        <w:spacing w:after="100"/>
+        <w:ind w:left="0"/>
+      </w:pPr>
+      <w:r>
+        <w:rPr>
+          <w:b/>
+          <w:bCs/>
+          <w:sz w:val="22"/>
+          <w:szCs w:val="22"/>
+        </w:rPr>
+        <w:t>Appendix B — PennyLane-Rendered Quantum Circuit Diagrams and Specifications</w:t>
+      </w:r>
+      <w:r>
+        <w:rPr>
+          <w:b/>
+          <w:bCs/>
+          <w:sz w:val="22"/>
+          <w:szCs w:val="22"/>
+        </w:rPr>
+        <w:tab/>
+        <w:t>58</w:t>
       </w:r>
     </w:p>
     <w:p>
@@ -1994,6 +2022,9 @@
       </w:pPr>
       <w:r>
         <w:t xml:space="preserve">Sections 2 through 10 describe the system as built: the end-to-end architecture, how data flows through it, the benchmark graph, the classical encoder, the quantum head and its circuit, what is trainable versus frozen, the training and evaluation workflow, and the roadmap of experiments in the order they were run. Sections 11 and 12 state the experimental setup and, for every experiment, exactly what was changed and what was held fixed. Section 13 presents the results in detail, organized so that every major result carries both a numerical table and a visual figure. Section 14 discusses what the results mean, explicitly separating observed results from interpretations and from hypotheses for future work. Sections 15 through 18 cover limitations, the conclusion, future work, and reproducibility. Appendix A carries the final decision matrix.</w:t>
+      </w:r>
+      <w:r>
+        <w:t xml:space="preserve"> Appendix B provides PennyLane-rendered quantum circuit diagrams and exact circuit specifications for the reference architecture and the ablation-tested ansatz variants.</w:t>
       </w:r>
     </w:p>
     <w:p>
@@ -2846,6 +2877,12 @@
       <w:r>
         <w:t xml:space="preserve">Introduce: reading left to right, the circuit is encode once, then entangle-and-rotate twice, then measure once — there is no mid-circuit measurement and no classical feedback within a single forward pass. Observe: the entangling gates connect each qubit to its neighbor in a ring, so information originating on any one qubit can reach every other qubit within the two layers shown. Explain: this connectivity is what allows the six Pauli-Z outputs to become mutually correlated — a property measured directly in Section 13.12's quantum-representation analysis, where cross-channel correlation is shown to depend on exactly this entangling structure and on the ansatz variant used. Limitation, stated directly in the figure's own caption as required: the per-layer entangling range is determined internally by PennyLane's StronglyEntanglingLayers template rather than fixed by this project's own code, so the ring pattern drawn here is the representative, logically-equivalent connectivity for six qubits — not a claim that every layer's range parameter has been individually hand-verified gate by gate.</w:t>
       </w:r>
+      <w:r>
+        <w:rPr>
+          <w:i/>
+        </w:rPr>
+        <w:t xml:space="preserve"> See Appendix B for the same circuit rendered directly by PennyLane's own qml.draw_mpl from the production code (src/scm_dataset/modeling/quantum/circuit.py), which removes this hand-verification caveat entirely.</w:t>
+      </w:r>
     </w:p>
     <w:p>
       <w:r>
@@ -22163,6 +22200,1008 @@
         </w:tc>
       </w:tr>
     </w:tbl>
+    <w:p>
+      <w:r>
+        <w:br w:type="page"/>
+      </w:r>
+    </w:p>
+    <w:p>
+      <w:pPr>
+        <w:pStyle w:val="Heading1"/>
+      </w:pPr>
+      <w:r>
+        <w:t>Appendix B — PennyLane-Rendered Quantum Circuit Diagrams and Specifications</w:t>
+      </w:r>
+    </w:p>
+    <w:p>
+      <w:r>
+        <w:t>Every diagram and every number in this appendix is generated directly from this project's own production code — src/scm_dataset/modeling/quantum/circuit.py's build_quantum_layer() — using PennyLane's own qml.draw_mpl and qml.specs functions (scripts/build_pennylane_circuit_diagrams.py), not hand-drawn or manually transcribed. Gates are shown at PennyLane's “device” decomposition level, so every template (AngleEmbedding, StronglyEntanglingLayers, ...) is expanded into the literal elementary gates (RY, RZ, Rot, CNOT) executed on the simulator, for exactly the qubit/layer/ansatz configurations this project actually ran. Parameter values shown on each gate are from a fixed random seed (torch.manual_seed(0)) used only to make the diagram concrete — the gate structure, qubit count, and parameter count are what matter and are identical for every seed.</w:t>
+      </w:r>
+    </w:p>
+    <w:p>
+      <w:pPr>
+        <w:pStyle w:val="Heading2"/>
+      </w:pPr>
+      <w:r>
+        <w:t>B.1 Reference Circuit: StronglyEntanglingLayers (6 Qubits, 2 Layers)</w:t>
+      </w:r>
+    </w:p>
+    <w:p>
+      <w:r>
+        <w:t>This is the exact circuit behind every headline Primary and Severity result in this report (configs/qgnn_v4.yaml and configs/qgnn_v4_severity.yaml: quantum_v4.n_qubits=6, n_layers=2, ansatz=strongly_entangling), decomposed and drawn by PennyLane itself rather than approximated in Figure 6.</w:t>
+      </w:r>
+    </w:p>
+    <w:p>
+      <w:pPr>
+        <w:spacing w:after="120" w:before="120" w:line="240" w:lineRule="auto"/>
+        <w:jc w:val="center"/>
+      </w:pPr>
+      <w:r>
+        <w:drawing>
+          <wp:inline xmlns:a="http://schemas.openxmlformats.org/drawingml/2006/main" xmlns:pic="http://schemas.openxmlformats.org/drawingml/2006/picture">
+            <wp:extent cx="5760720" cy="2377088"/>
+            <wp:docPr id="2" name="Picture 2"/>
+            <wp:cNvGraphicFramePr>
+              <a:graphicFrameLocks noChangeAspect="1"/>
+            </wp:cNvGraphicFramePr>
+            <a:graphic>
+              <a:graphicData uri="http://schemas.openxmlformats.org/drawingml/2006/picture">
+                <pic:pic>
+                  <pic:nvPicPr>
+                    <pic:cNvPr id="0" name="fig_appendixB1_reference_circuit_pennylane.png"/>
+                    <pic:cNvPicPr/>
+                  </pic:nvPicPr>
+                  <pic:blipFill>
+                    <a:blip r:embed="rId30"/>
+                    <a:stretch>
+                      <a:fillRect/>
+                    </a:stretch>
+                  </pic:blipFill>
+                  <pic:spPr>
+                    <a:xfrm>
+                      <a:off x="0" y="0"/>
+                      <a:ext cx="5760720" cy="2377088"/>
+                    </a:xfrm>
+                    <a:prstGeom prst="rect"/>
+                  </pic:spPr>
+                </pic:pic>
+              </a:graphicData>
+            </a:graphic>
+          </wp:inline>
+        </w:drawing>
+      </w:r>
+    </w:p>
+    <w:p>
+      <w:pPr>
+        <w:jc w:val="center"/>
+      </w:pPr>
+      <w:r>
+        <w:rPr>
+          <w:b/>
+          <w:sz w:val="20"/>
+        </w:rPr>
+        <w:t xml:space="preserve">Figure B1. </w:t>
+      </w:r>
+      <w:r>
+        <w:rPr>
+          <w:sz w:val="20"/>
+        </w:rPr>
+        <w:t>PennyLane-rendered (qml.draw_mpl, device-level decomposition) circuit for the standing QGNN-v4 reference head: RY angle embedding on 6 qubits, two variational layers of a general single-qubit rotation (Rot) followed by a ring of CNOT entangling gates, and Pauli-Z measurement on every qubit. This is the literal gate sequence PennyLane executes — not a logical approximation.</w:t>
+      </w:r>
+    </w:p>
+    <w:p>
+      <w:r>
+        <w:t>Table B1 lists the circuit's exact specifications, read directly from qml.specs() at device-decomposition level: every gate PennyLane counts, the resulting circuit depth, and the number of trainable quantum parameters registered as ordinary PyTorch parameters via qml.qnn.TorchLayer.</w:t>
+      </w:r>
+    </w:p>
+    <w:tbl>
+      <w:tblPr>
+        <w:tblW w:type="auto" w:w="0"/>
+        <w:tblLayout w:type="fixed"/>
+        <w:tblLook w:firstColumn="1" w:firstRow="1" w:lastColumn="0" w:lastRow="0" w:noHBand="0" w:noVBand="1" w:val="04A0"/>
+        <w:tblBorders>
+          <w:top w:val="single" w:sz="4" w:color="auto"/>
+          <w:left w:val="single" w:sz="4" w:color="auto"/>
+          <w:bottom w:val="single" w:sz="4" w:color="auto"/>
+          <w:right w:val="single" w:sz="4" w:color="auto"/>
+          <w:insideH w:val="single" w:sz="4" w:color="auto"/>
+          <w:insideV w:val="single" w:sz="4" w:color="auto"/>
+        </w:tblBorders>
+      </w:tblPr>
+      <w:tblGrid>
+        <w:gridCol w:w="3744"/>
+        <w:gridCol w:w="5328"/>
+      </w:tblGrid>
+      <w:tr>
+        <w:tc>
+          <w:tcPr>
+            <w:tcW w:type="dxa" w:w="3744"/>
+            <w:shd w:val="clear" w:color="auto" w:fill="2E5395"/>
+          </w:tcPr>
+          <w:p>
+            <w:pPr>
+              <w:jc w:val="center"/>
+            </w:pPr>
+            <w:r>
+              <w:rPr>
+                <w:b/>
+                <w:color w:val="FFFFFF"/>
+                <w:sz w:val="19"/>
+              </w:rPr>
+              <w:t>Property</w:t>
+            </w:r>
+          </w:p>
+        </w:tc>
+        <w:tc>
+          <w:tcPr>
+            <w:tcW w:type="dxa" w:w="5328"/>
+            <w:shd w:val="clear" w:color="auto" w:fill="2E5395"/>
+          </w:tcPr>
+          <w:p>
+            <w:pPr>
+              <w:jc w:val="center"/>
+            </w:pPr>
+            <w:r>
+              <w:rPr>
+                <w:b/>
+                <w:color w:val="FFFFFF"/>
+                <w:sz w:val="19"/>
+              </w:rPr>
+              <w:t>Value</w:t>
+            </w:r>
+          </w:p>
+        </w:tc>
+      </w:tr>
+      <w:tr>
+        <w:tc>
+          <w:tcPr>
+            <w:tcW w:type="dxa" w:w="3744"/>
+          </w:tcPr>
+          <w:p>
+            <w:pPr>
+              <w:jc w:val="left"/>
+            </w:pPr>
+            <w:r>
+              <w:rPr>
+                <w:sz w:val="19"/>
+              </w:rPr>
+              <w:t>Qubits (wires)</w:t>
+            </w:r>
+          </w:p>
+        </w:tc>
+        <w:tc>
+          <w:tcPr>
+            <w:tcW w:type="dxa" w:w="5328"/>
+          </w:tcPr>
+          <w:p>
+            <w:pPr>
+              <w:jc w:val="center"/>
+            </w:pPr>
+            <w:r>
+              <w:rPr>
+                <w:sz w:val="19"/>
+              </w:rPr>
+              <w:t>6</w:t>
+            </w:r>
+          </w:p>
+        </w:tc>
+      </w:tr>
+      <w:tr>
+        <w:tc>
+          <w:tcPr>
+            <w:tcW w:type="dxa" w:w="3744"/>
+          </w:tcPr>
+          <w:p>
+            <w:pPr>
+              <w:jc w:val="left"/>
+            </w:pPr>
+            <w:r>
+              <w:rPr>
+                <w:sz w:val="19"/>
+              </w:rPr>
+              <w:t>Variational layers</w:t>
+            </w:r>
+          </w:p>
+        </w:tc>
+        <w:tc>
+          <w:tcPr>
+            <w:tcW w:type="dxa" w:w="5328"/>
+          </w:tcPr>
+          <w:p>
+            <w:pPr>
+              <w:jc w:val="center"/>
+            </w:pPr>
+            <w:r>
+              <w:rPr>
+                <w:sz w:val="19"/>
+              </w:rPr>
+              <w:t>2</w:t>
+            </w:r>
+          </w:p>
+        </w:tc>
+      </w:tr>
+      <w:tr>
+        <w:tc>
+          <w:tcPr>
+            <w:tcW w:type="dxa" w:w="3744"/>
+          </w:tcPr>
+          <w:p>
+            <w:pPr>
+              <w:jc w:val="left"/>
+            </w:pPr>
+            <w:r>
+              <w:rPr>
+                <w:sz w:val="19"/>
+              </w:rPr>
+              <w:t>Ansatz</w:t>
+            </w:r>
+          </w:p>
+        </w:tc>
+        <w:tc>
+          <w:tcPr>
+            <w:tcW w:type="dxa" w:w="5328"/>
+          </w:tcPr>
+          <w:p>
+            <w:pPr>
+              <w:jc w:val="center"/>
+            </w:pPr>
+            <w:r>
+              <w:rPr>
+                <w:sz w:val="19"/>
+              </w:rPr>
+              <w:t>StronglyEntanglingLayers (PennyLane built-in template)</w:t>
+            </w:r>
+          </w:p>
+        </w:tc>
+      </w:tr>
+      <w:tr>
+        <w:tc>
+          <w:tcPr>
+            <w:tcW w:type="dxa" w:w="3744"/>
+          </w:tcPr>
+          <w:p>
+            <w:pPr>
+              <w:jc w:val="left"/>
+            </w:pPr>
+            <w:r>
+              <w:rPr>
+                <w:sz w:val="19"/>
+              </w:rPr>
+              <w:t>Encoding</w:t>
+            </w:r>
+          </w:p>
+        </w:tc>
+        <w:tc>
+          <w:tcPr>
+            <w:tcW w:type="dxa" w:w="5328"/>
+          </w:tcPr>
+          <w:p>
+            <w:pPr>
+              <w:jc w:val="center"/>
+            </w:pPr>
+            <w:r>
+              <w:rPr>
+                <w:sz w:val="19"/>
+              </w:rPr>
+              <w:t>AngleEmbedding, rotation=“Y” (1 RY gate per qubit)</w:t>
+            </w:r>
+          </w:p>
+        </w:tc>
+      </w:tr>
+      <w:tr>
+        <w:tc>
+          <w:tcPr>
+            <w:tcW w:type="dxa" w:w="3744"/>
+          </w:tcPr>
+          <w:p>
+            <w:pPr>
+              <w:jc w:val="left"/>
+            </w:pPr>
+            <w:r>
+              <w:rPr>
+                <w:sz w:val="19"/>
+              </w:rPr>
+              <w:t>Gate composition (device level)</w:t>
+            </w:r>
+          </w:p>
+        </w:tc>
+        <w:tc>
+          <w:tcPr>
+            <w:tcW w:type="dxa" w:w="5328"/>
+          </w:tcPr>
+          <w:p>
+            <w:pPr>
+              <w:jc w:val="center"/>
+            </w:pPr>
+            <w:r>
+              <w:rPr>
+                <w:sz w:val="19"/>
+              </w:rPr>
+              <w:t>RY×6, Rot×12, CNOT×12</w:t>
+            </w:r>
+          </w:p>
+        </w:tc>
+      </w:tr>
+      <w:tr>
+        <w:tc>
+          <w:tcPr>
+            <w:tcW w:type="dxa" w:w="3744"/>
+          </w:tcPr>
+          <w:p>
+            <w:pPr>
+              <w:jc w:val="left"/>
+            </w:pPr>
+            <w:r>
+              <w:rPr>
+                <w:sz w:val="19"/>
+              </w:rPr>
+              <w:t>Total gate count</w:t>
+            </w:r>
+          </w:p>
+        </w:tc>
+        <w:tc>
+          <w:tcPr>
+            <w:tcW w:type="dxa" w:w="5328"/>
+          </w:tcPr>
+          <w:p>
+            <w:pPr>
+              <w:jc w:val="center"/>
+            </w:pPr>
+            <w:r>
+              <w:rPr>
+                <w:sz w:val="19"/>
+              </w:rPr>
+              <w:t>30</w:t>
+            </w:r>
+          </w:p>
+        </w:tc>
+      </w:tr>
+      <w:tr>
+        <w:tc>
+          <w:tcPr>
+            <w:tcW w:type="dxa" w:w="3744"/>
+          </w:tcPr>
+          <w:p>
+            <w:pPr>
+              <w:jc w:val="left"/>
+            </w:pPr>
+            <w:r>
+              <w:rPr>
+                <w:sz w:val="19"/>
+              </w:rPr>
+              <w:t>Circuit depth</w:t>
+            </w:r>
+          </w:p>
+        </w:tc>
+        <w:tc>
+          <w:tcPr>
+            <w:tcW w:type="dxa" w:w="5328"/>
+          </w:tcPr>
+          <w:p>
+            <w:pPr>
+              <w:jc w:val="center"/>
+            </w:pPr>
+            <w:r>
+              <w:rPr>
+                <w:sz w:val="19"/>
+              </w:rPr>
+              <w:t>12</w:t>
+            </w:r>
+          </w:p>
+        </w:tc>
+      </w:tr>
+      <w:tr>
+        <w:tc>
+          <w:tcPr>
+            <w:tcW w:type="dxa" w:w="3744"/>
+          </w:tcPr>
+          <w:p>
+            <w:pPr>
+              <w:jc w:val="left"/>
+            </w:pPr>
+            <w:r>
+              <w:rPr>
+                <w:sz w:val="19"/>
+              </w:rPr>
+              <w:t>Trainable quantum parameters</w:t>
+            </w:r>
+          </w:p>
+        </w:tc>
+        <w:tc>
+          <w:tcPr>
+            <w:tcW w:type="dxa" w:w="5328"/>
+          </w:tcPr>
+          <w:p>
+            <w:pPr>
+              <w:jc w:val="center"/>
+            </w:pPr>
+            <w:r>
+              <w:rPr>
+                <w:sz w:val="19"/>
+              </w:rPr>
+              <w:t>36</w:t>
+            </w:r>
+          </w:p>
+        </w:tc>
+      </w:tr>
+      <w:tr>
+        <w:tc>
+          <w:tcPr>
+            <w:tcW w:type="dxa" w:w="3744"/>
+          </w:tcPr>
+          <w:p>
+            <w:pPr>
+              <w:jc w:val="left"/>
+            </w:pPr>
+            <w:r>
+              <w:rPr>
+                <w:sz w:val="19"/>
+              </w:rPr>
+              <w:t>Measurement</w:t>
+            </w:r>
+          </w:p>
+        </w:tc>
+        <w:tc>
+          <w:tcPr>
+            <w:tcW w:type="dxa" w:w="5328"/>
+          </w:tcPr>
+          <w:p>
+            <w:pPr>
+              <w:jc w:val="center"/>
+            </w:pPr>
+            <w:r>
+              <w:rPr>
+                <w:sz w:val="19"/>
+              </w:rPr>
+              <w:t>expval(PauliZ) on all 6 qubits</w:t>
+            </w:r>
+          </w:p>
+        </w:tc>
+      </w:tr>
+      <w:tr>
+        <w:tc>
+          <w:tcPr>
+            <w:tcW w:type="dxa" w:w="3744"/>
+          </w:tcPr>
+          <w:p>
+            <w:pPr>
+              <w:jc w:val="left"/>
+            </w:pPr>
+            <w:r>
+              <w:rPr>
+                <w:sz w:val="19"/>
+              </w:rPr>
+              <w:t>Device</w:t>
+            </w:r>
+          </w:p>
+        </w:tc>
+        <w:tc>
+          <w:tcPr>
+            <w:tcW w:type="dxa" w:w="5328"/>
+          </w:tcPr>
+          <w:p>
+            <w:pPr>
+              <w:jc w:val="center"/>
+            </w:pPr>
+            <w:r>
+              <w:rPr>
+                <w:sz w:val="19"/>
+              </w:rPr>
+              <w:t>default.qubit</w:t>
+            </w:r>
+          </w:p>
+        </w:tc>
+      </w:tr>
+      <w:tr>
+        <w:tc>
+          <w:tcPr>
+            <w:tcW w:type="dxa" w:w="3744"/>
+          </w:tcPr>
+          <w:p>
+            <w:pPr>
+              <w:jc w:val="left"/>
+            </w:pPr>
+            <w:r>
+              <w:rPr>
+                <w:sz w:val="19"/>
+              </w:rPr>
+              <w:t>Differentiation method</w:t>
+            </w:r>
+          </w:p>
+        </w:tc>
+        <w:tc>
+          <w:tcPr>
+            <w:tcW w:type="dxa" w:w="5328"/>
+          </w:tcPr>
+          <w:p>
+            <w:pPr>
+              <w:jc w:val="center"/>
+            </w:pPr>
+            <w:r>
+              <w:rPr>
+                <w:sz w:val="19"/>
+              </w:rPr>
+              <w:t>backprop (exact analytic gradient on the state-vector simulator)</w:t>
+            </w:r>
+          </w:p>
+        </w:tc>
+      </w:tr>
+    </w:tbl>
+    <w:p>
+      <w:pPr>
+        <w:jc w:val="center"/>
+      </w:pPr>
+      <w:r>
+        <w:rPr>
+          <w:b/>
+          <w:sz w:val="20"/>
+        </w:rPr>
+        <w:t xml:space="preserve">Table B1. </w:t>
+      </w:r>
+      <w:r>
+        <w:rPr>
+          <w:sz w:val="20"/>
+        </w:rPr>
+        <w:t>Exact specifications of the reference QGNN-v4 quantum circuit, from qml.specs().</w:t>
+      </w:r>
+    </w:p>
+    <w:p>
+      <w:pPr>
+        <w:pStyle w:val="Heading2"/>
+      </w:pPr>
+      <w:r>
+        <w:t>B.2 Ablation-Tested Ansatz Variants (Section 13.6, Phase 4 Stage 5)</w:t>
+      </w:r>
+    </w:p>
+    <w:p>
+      <w:r>
+        <w:t>Section 13.6's ansatz/entanglement-topology ablation (QGNN_V4_ABLATION_TABLE.csv) compared the reference circuit above against two other ansatz choices, both already implemented in the same production module and both actually run for that ablation — rendered here the same way, from the same code, for direct visual comparison.</w:t>
+      </w:r>
+    </w:p>
+    <w:p>
+      <w:pPr>
+        <w:spacing w:after="120" w:before="120" w:line="240" w:lineRule="auto"/>
+        <w:jc w:val="center"/>
+      </w:pPr>
+      <w:r>
+        <w:drawing>
+          <wp:inline xmlns:a="http://schemas.openxmlformats.org/drawingml/2006/main" xmlns:pic="http://schemas.openxmlformats.org/drawingml/2006/picture">
+            <wp:extent cx="5943600" cy="2209725"/>
+            <wp:docPr id="3" name="Picture 3"/>
+            <wp:cNvGraphicFramePr>
+              <a:graphicFrameLocks noChangeAspect="1"/>
+            </wp:cNvGraphicFramePr>
+            <a:graphic>
+              <a:graphicData uri="http://schemas.openxmlformats.org/drawingml/2006/picture">
+                <pic:pic>
+                  <pic:nvPicPr>
+                    <pic:cNvPr id="0" name="fig_appendixB2_hardware_efficient_ring_pennylane.png"/>
+                    <pic:cNvPicPr/>
+                  </pic:nvPicPr>
+                  <pic:blipFill>
+                    <a:blip r:embed="rId31"/>
+                    <a:stretch>
+                      <a:fillRect/>
+                    </a:stretch>
+                  </pic:blipFill>
+                  <pic:spPr>
+                    <a:xfrm>
+                      <a:off x="0" y="0"/>
+                      <a:ext cx="5943600" cy="2209725"/>
+                    </a:xfrm>
+                    <a:prstGeom prst="rect"/>
+                  </pic:spPr>
+                </pic:pic>
+              </a:graphicData>
+            </a:graphic>
+          </wp:inline>
+        </w:drawing>
+      </w:r>
+    </w:p>
+    <w:p>
+      <w:pPr>
+        <w:jc w:val="center"/>
+      </w:pPr>
+      <w:r>
+        <w:rPr>
+          <w:b/>
+          <w:sz w:val="20"/>
+        </w:rPr>
+        <w:t xml:space="preserve">Figure B2. </w:t>
+      </w:r>
+      <w:r>
+        <w:rPr>
+          <w:sz w:val="20"/>
+        </w:rPr>
+        <w:t>PennyLane-rendered hardware_efficient_ring variant: RY then RZ per qubit per layer (2 trainable rotation parameters/qubit/layer) followed by a CNOT ring.</w:t>
+      </w:r>
+    </w:p>
+    <w:p>
+      <w:pPr>
+        <w:spacing w:after="120" w:before="120" w:line="240" w:lineRule="auto"/>
+        <w:jc w:val="center"/>
+      </w:pPr>
+      <w:r>
+        <w:drawing>
+          <wp:inline xmlns:a="http://schemas.openxmlformats.org/drawingml/2006/main" xmlns:pic="http://schemas.openxmlformats.org/drawingml/2006/picture">
+            <wp:extent cx="5120640" cy="2913334"/>
+            <wp:docPr id="4" name="Picture 4"/>
+            <wp:cNvGraphicFramePr>
+              <a:graphicFrameLocks noChangeAspect="1"/>
+            </wp:cNvGraphicFramePr>
+            <a:graphic>
+              <a:graphicData uri="http://schemas.openxmlformats.org/drawingml/2006/picture">
+                <pic:pic>
+                  <pic:nvPicPr>
+                    <pic:cNvPr id="0" name="fig_appendixB3_reduced_entanglement_pennylane.png"/>
+                    <pic:cNvPicPr/>
+                  </pic:nvPicPr>
+                  <pic:blipFill>
+                    <a:blip r:embed="rId32"/>
+                    <a:stretch>
+                      <a:fillRect/>
+                    </a:stretch>
+                  </pic:blipFill>
+                  <pic:spPr>
+                    <a:xfrm>
+                      <a:off x="0" y="0"/>
+                      <a:ext cx="5120640" cy="2913334"/>
+                    </a:xfrm>
+                    <a:prstGeom prst="rect"/>
+                  </pic:spPr>
+                </pic:pic>
+              </a:graphicData>
+            </a:graphic>
+          </wp:inline>
+        </w:drawing>
+      </w:r>
+    </w:p>
+    <w:p>
+      <w:pPr>
+        <w:jc w:val="center"/>
+      </w:pPr>
+      <w:r>
+        <w:rPr>
+          <w:b/>
+          <w:sz w:val="20"/>
+        </w:rPr>
+        <w:t xml:space="preserve">Figure B3. </w:t>
+      </w:r>
+      <w:r>
+        <w:rPr>
+          <w:sz w:val="20"/>
+        </w:rPr>
+        <w:t>PennyLane-rendered reduced_entanglement variant: RY only per qubit per layer (1 trainable rotation parameter/qubit/layer) followed by a CNOT chain (no wrap-around).</w:t>
+      </w:r>
+    </w:p>
+    <w:p>
+      <w:r>
+        <w:t>Table B2 compares the three ansatz variants' exact gate composition and parameter counts side by side — the same 36/24/12 trainable-parameter figures Section 13.6 reports, here traced directly to the gate-level circuit that produces them.</w:t>
+      </w:r>
+    </w:p>
+    <w:tbl>
+      <w:tblPr>
+        <w:tblW w:type="auto" w:w="0"/>
+        <w:tblLayout w:type="fixed"/>
+        <w:tblLook w:firstColumn="1" w:firstRow="1" w:lastColumn="0" w:lastRow="0" w:noHBand="0" w:noVBand="1" w:val="04A0"/>
+        <w:tblBorders>
+          <w:top w:val="single" w:sz="4" w:color="auto"/>
+          <w:left w:val="single" w:sz="4" w:color="auto"/>
+          <w:bottom w:val="single" w:sz="4" w:color="auto"/>
+          <w:right w:val="single" w:sz="4" w:color="auto"/>
+          <w:insideH w:val="single" w:sz="4" w:color="auto"/>
+          <w:insideV w:val="single" w:sz="4" w:color="auto"/>
+        </w:tblBorders>
+      </w:tblPr>
+      <w:tblGrid>
+        <w:gridCol w:w="3024"/>
+        <w:gridCol w:w="1872"/>
+        <w:gridCol w:w="3456"/>
+        <w:gridCol w:w="1152"/>
+      </w:tblGrid>
+      <w:tr>
+        <w:tc>
+          <w:tcPr>
+            <w:tcW w:type="dxa" w:w="3024"/>
+            <w:shd w:val="clear" w:color="auto" w:fill="2E5395"/>
+          </w:tcPr>
+          <w:p>
+            <w:pPr>
+              <w:jc w:val="center"/>
+            </w:pPr>
+            <w:r>
+              <w:rPr>
+                <w:b/>
+                <w:color w:val="FFFFFF"/>
+                <w:sz w:val="19"/>
+              </w:rPr>
+              <w:t>Ansatz</w:t>
+            </w:r>
+          </w:p>
+        </w:tc>
+        <w:tc>
+          <w:tcPr>
+            <w:tcW w:type="dxa" w:w="1872"/>
+            <w:shd w:val="clear" w:color="auto" w:fill="2E5395"/>
+          </w:tcPr>
+          <w:p>
+            <w:pPr>
+              <w:jc w:val="center"/>
+            </w:pPr>
+            <w:r>
+              <w:rPr>
+                <w:b/>
+                <w:color w:val="FFFFFF"/>
+                <w:sz w:val="19"/>
+              </w:rPr>
+              <w:t>Trainable params</w:t>
+            </w:r>
+          </w:p>
+        </w:tc>
+        <w:tc>
+          <w:tcPr>
+            <w:tcW w:type="dxa" w:w="3456"/>
+            <w:shd w:val="clear" w:color="auto" w:fill="2E5395"/>
+          </w:tcPr>
+          <w:p>
+            <w:pPr>
+              <w:jc w:val="center"/>
+            </w:pPr>
+            <w:r>
+              <w:rPr>
+                <w:b/>
+                <w:color w:val="FFFFFF"/>
+                <w:sz w:val="19"/>
+              </w:rPr>
+              <w:t>Gate composition (device level)</w:t>
+            </w:r>
+          </w:p>
+        </w:tc>
+        <w:tc>
+          <w:tcPr>
+            <w:tcW w:type="dxa" w:w="1152"/>
+            <w:shd w:val="clear" w:color="auto" w:fill="2E5395"/>
+          </w:tcPr>
+          <w:p>
+            <w:pPr>
+              <w:jc w:val="center"/>
+            </w:pPr>
+            <w:r>
+              <w:rPr>
+                <w:b/>
+                <w:color w:val="FFFFFF"/>
+                <w:sz w:val="19"/>
+              </w:rPr>
+              <w:t>Depth</w:t>
+            </w:r>
+          </w:p>
+        </w:tc>
+      </w:tr>
+      <w:tr>
+        <w:tc>
+          <w:tcPr>
+            <w:tcW w:type="dxa" w:w="3024"/>
+          </w:tcPr>
+          <w:p>
+            <w:pPr>
+              <w:jc w:val="left"/>
+            </w:pPr>
+            <w:r>
+              <w:rPr>
+                <w:sz w:val="19"/>
+              </w:rPr>
+              <w:t>strongly_entangling (reference)</w:t>
+            </w:r>
+          </w:p>
+        </w:tc>
+        <w:tc>
+          <w:tcPr>
+            <w:tcW w:type="dxa" w:w="1872"/>
+          </w:tcPr>
+          <w:p>
+            <w:pPr>
+              <w:jc w:val="center"/>
+            </w:pPr>
+            <w:r>
+              <w:rPr>
+                <w:sz w:val="19"/>
+              </w:rPr>
+              <w:t>36</w:t>
+            </w:r>
+          </w:p>
+        </w:tc>
+        <w:tc>
+          <w:tcPr>
+            <w:tcW w:type="dxa" w:w="3456"/>
+          </w:tcPr>
+          <w:p>
+            <w:pPr>
+              <w:jc w:val="center"/>
+            </w:pPr>
+            <w:r>
+              <w:rPr>
+                <w:sz w:val="19"/>
+              </w:rPr>
+              <w:t>RY×6, Rot×12, CNOT×12</w:t>
+            </w:r>
+          </w:p>
+        </w:tc>
+        <w:tc>
+          <w:tcPr>
+            <w:tcW w:type="dxa" w:w="1152"/>
+          </w:tcPr>
+          <w:p>
+            <w:pPr>
+              <w:jc w:val="center"/>
+            </w:pPr>
+            <w:r>
+              <w:rPr>
+                <w:sz w:val="19"/>
+              </w:rPr>
+              <w:t>12</w:t>
+            </w:r>
+          </w:p>
+        </w:tc>
+      </w:tr>
+      <w:tr>
+        <w:tc>
+          <w:tcPr>
+            <w:tcW w:type="dxa" w:w="3024"/>
+          </w:tcPr>
+          <w:p>
+            <w:pPr>
+              <w:jc w:val="left"/>
+            </w:pPr>
+            <w:r>
+              <w:rPr>
+                <w:sz w:val="19"/>
+              </w:rPr>
+              <w:t>hardware_efficient_ring</w:t>
+            </w:r>
+          </w:p>
+        </w:tc>
+        <w:tc>
+          <w:tcPr>
+            <w:tcW w:type="dxa" w:w="1872"/>
+          </w:tcPr>
+          <w:p>
+            <w:pPr>
+              <w:jc w:val="center"/>
+            </w:pPr>
+            <w:r>
+              <w:rPr>
+                <w:sz w:val="19"/>
+              </w:rPr>
+              <w:t>24</w:t>
+            </w:r>
+          </w:p>
+        </w:tc>
+        <w:tc>
+          <w:tcPr>
+            <w:tcW w:type="dxa" w:w="3456"/>
+          </w:tcPr>
+          <w:p>
+            <w:pPr>
+              <w:jc w:val="center"/>
+            </w:pPr>
+            <w:r>
+              <w:rPr>
+                <w:sz w:val="19"/>
+              </w:rPr>
+              <w:t>RY×18, RZ×12, CNOT×12</w:t>
+            </w:r>
+          </w:p>
+        </w:tc>
+        <w:tc>
+          <w:tcPr>
+            <w:tcW w:type="dxa" w:w="1152"/>
+          </w:tcPr>
+          <w:p>
+            <w:pPr>
+              <w:jc w:val="center"/>
+            </w:pPr>
+            <w:r>
+              <w:rPr>
+                <w:sz w:val="19"/>
+              </w:rPr>
+              <w:t>17</w:t>
+            </w:r>
+          </w:p>
+        </w:tc>
+      </w:tr>
+      <w:tr>
+        <w:tc>
+          <w:tcPr>
+            <w:tcW w:type="dxa" w:w="3024"/>
+          </w:tcPr>
+          <w:p>
+            <w:pPr>
+              <w:jc w:val="left"/>
+            </w:pPr>
+            <w:r>
+              <w:rPr>
+                <w:sz w:val="19"/>
+              </w:rPr>
+              <w:t>reduced_entanglement</w:t>
+            </w:r>
+          </w:p>
+        </w:tc>
+        <w:tc>
+          <w:tcPr>
+            <w:tcW w:type="dxa" w:w="1872"/>
+          </w:tcPr>
+          <w:p>
+            <w:pPr>
+              <w:jc w:val="center"/>
+            </w:pPr>
+            <w:r>
+              <w:rPr>
+                <w:sz w:val="19"/>
+              </w:rPr>
+              <w:t>12</w:t>
+            </w:r>
+          </w:p>
+        </w:tc>
+        <w:tc>
+          <w:tcPr>
+            <w:tcW w:type="dxa" w:w="3456"/>
+          </w:tcPr>
+          <w:p>
+            <w:pPr>
+              <w:jc w:val="center"/>
+            </w:pPr>
+            <w:r>
+              <w:rPr>
+                <w:sz w:val="19"/>
+              </w:rPr>
+              <w:t>RY×18, CNOT×10</w:t>
+            </w:r>
+          </w:p>
+        </w:tc>
+        <w:tc>
+          <w:tcPr>
+            <w:tcW w:type="dxa" w:w="1152"/>
+          </w:tcPr>
+          <w:p>
+            <w:pPr>
+              <w:jc w:val="center"/>
+            </w:pPr>
+            <w:r>
+              <w:rPr>
+                <w:sz w:val="19"/>
+              </w:rPr>
+              <w:t>10</w:t>
+            </w:r>
+          </w:p>
+        </w:tc>
+      </w:tr>
+    </w:tbl>
+    <w:p>
+      <w:pPr>
+        <w:jc w:val="center"/>
+      </w:pPr>
+      <w:r>
+        <w:rPr>
+          <w:b/>
+          <w:sz w:val="20"/>
+        </w:rPr>
+        <w:t xml:space="preserve">Table B2. </w:t>
+      </w:r>
+      <w:r>
+        <w:rPr>
+          <w:sz w:val="20"/>
+        </w:rPr>
+        <w:t>Gate-level comparison of the three ansatz variants tested in Section 13.6's ablation, all read from qml.specs() on the actual production circuit.</w:t>
+      </w:r>
+    </w:p>
+    <w:p>
+      <w:r>
+        <w:rPr>
+          <w:i/>
+        </w:rPr>
+        <w:t>Reproduction: python scripts/build_pennylane_circuit_diagrams.py regenerates every figure and the specs JSON in this appendix directly from src/scm_dataset/modeling/quantum/circuit.py.</w:t>
+      </w:r>
+    </w:p>
     <w:sectPr>
       <w:headerReference w:type="default" r:id="rId7"/>
       <w:footerReference w:type="default" r:id="rId8"/>

</xml_diff>